<commit_message>
Refresh course links docx
</commit_message>
<xml_diff>
--- a/完整课程链接.docx
+++ b/完整课程链接.docx
@@ -40,7 +40,7 @@
         <w:rPr>
           <w:rStyle w:val="VerbatimChar"/>
         </w:rPr>
-        <w:t xml:space="preserve">&lt;repo-pages-base-url&gt;</w:t>
+        <w:t xml:space="preserve">https://frankfika.github.io/course-recording-event-pages</w:t>
       </w:r>
       <w:r>
         <w:t xml:space="preserve"> </w:t>
@@ -82,7 +82,7 @@
         <w:rPr>
           <w:rStyle w:val="VerbatimChar"/>
         </w:rPr>
-        <w:t xml:space="preserve">&lt;repo-pages-base-url&gt;/</w:t>
+        <w:t xml:space="preserve">https://frankfika.github.io/course-recording-event-pages/</w:t>
       </w:r>
     </w:p>
     <w:p>
@@ -106,7 +106,7 @@
         <w:rPr>
           <w:rStyle w:val="VerbatimChar"/>
         </w:rPr>
-        <w:t xml:space="preserve">&lt;repo-pages-base-url&gt;/C1_chapter1/</w:t>
+        <w:t xml:space="preserve">https://frankfika.github.io/course-recording-event-pages/C1_chapter1/</w:t>
       </w:r>
     </w:p>
     <w:p>
@@ -130,7 +130,7 @@
         <w:rPr>
           <w:rStyle w:val="VerbatimChar"/>
         </w:rPr>
-        <w:t xml:space="preserve">&lt;repo-pages-base-url&gt;/C1_chapter2/</w:t>
+        <w:t xml:space="preserve">https://frankfika.github.io/course-recording-event-pages/C1_chapter2/</w:t>
       </w:r>
     </w:p>
     <w:p>
@@ -154,7 +154,7 @@
         <w:rPr>
           <w:rStyle w:val="VerbatimChar"/>
         </w:rPr>
-        <w:t xml:space="preserve">&lt;repo-pages-base-url&gt;/C1_chapter3/</w:t>
+        <w:t xml:space="preserve">https://frankfika.github.io/course-recording-event-pages/C1_chapter3/</w:t>
       </w:r>
     </w:p>
     <w:p>
@@ -178,7 +178,7 @@
         <w:rPr>
           <w:rStyle w:val="VerbatimChar"/>
         </w:rPr>
-        <w:t xml:space="preserve">&lt;repo-pages-base-url&gt;/C1_chapter4/</w:t>
+        <w:t xml:space="preserve">https://frankfika.github.io/course-recording-event-pages/C1_chapter4/</w:t>
       </w:r>
     </w:p>
     <w:p>
@@ -211,7 +211,7 @@
         <w:rPr>
           <w:rStyle w:val="VerbatimChar"/>
         </w:rPr>
-        <w:t xml:space="preserve">&lt;repo-pages-base-url&gt;/C1_chapter5/</w:t>
+        <w:t xml:space="preserve">https://frankfika.github.io/course-recording-event-pages/C1_chapter5/</w:t>
       </w:r>
     </w:p>
     <w:bookmarkStart w:id="20" w:name="本地源目录"/>

</xml_diff>

<commit_message>
Finalize published course links
</commit_message>
<xml_diff>
--- a/完整课程链接.docx
+++ b/完整课程链接.docx
@@ -22,7 +22,7 @@
         <w:rPr>
           <w:rFonts w:hint="eastAsia"/>
         </w:rPr>
-        <w:t xml:space="preserve">仓库与</w:t>
+        <w:t xml:space="preserve">下面是已经上线的</w:t>
       </w:r>
       <w:r>
         <w:t xml:space="preserve"> GitHub Pages </w:t>
@@ -31,37 +31,7 @@
         <w:rPr>
           <w:rFonts w:hint="eastAsia"/>
         </w:rPr>
-        <w:t xml:space="preserve">创建完成后，将下面的</w:t>
-      </w:r>
-      <w:r>
-        <w:t xml:space="preserve"> </w:t>
-      </w:r>
-      <w:r>
-        <w:rPr>
-          <w:rStyle w:val="VerbatimChar"/>
-        </w:rPr>
-        <w:t xml:space="preserve">https://frankfika.github.io/course-recording-event-pages</w:t>
-      </w:r>
-      <w:r>
-        <w:t xml:space="preserve"> </w:t>
-      </w:r>
-      <w:r>
-        <w:rPr>
-          <w:rFonts w:hint="eastAsia"/>
-        </w:rPr>
-        <w:t xml:space="preserve">替换成实际地址，例如</w:t>
-      </w:r>
-      <w:r>
-        <w:t xml:space="preserve"> </w:t>
-      </w:r>
-      <w:r>
-        <w:rPr>
-          <w:rStyle w:val="VerbatimChar"/>
-        </w:rPr>
-        <w:t xml:space="preserve">https://USERNAME.github.io/REPO-NAME</w:t>
-      </w:r>
-      <w:r>
-        <w:t xml:space="preserve">。</w:t>
+        <w:t xml:space="preserve">实际地址，可直接分发给学员或放进课程目录。</w:t>
       </w:r>
     </w:p>
     <w:p>

</xml_diff>